<commit_message>
Update website and CV
</commit_message>
<xml_diff>
--- a/files/nathan_onduma_cv.docx
+++ b/files/nathan_onduma_cv.docx
@@ -2,7 +2,7 @@
 <file path=word/document.xml><?xml version="1.0" encoding="utf-8"?>
 <w:document xmlns:w="http://schemas.openxmlformats.org/wordprocessingml/2006/main" xmlns:m="http://schemas.openxmlformats.org/officeDocument/2006/math" xmlns:r="http://schemas.openxmlformats.org/officeDocument/2006/relationships" xmlns:o="urn:schemas-microsoft-com:office:office" xmlns:v="urn:schemas-microsoft-com:vml" xmlns:w10="urn:schemas-microsoft-com:office:word" xmlns:a="http://schemas.openxmlformats.org/drawingml/2006/main" xmlns:pic="http://schemas.openxmlformats.org/drawingml/2006/picture" xmlns:wp="http://schemas.openxmlformats.org/drawingml/2006/wordprocessingDrawing">
   <w:body>
-    <w:bookmarkStart w:id="46" w:name="nathan-machuki-onduma"/>
+    <w:bookmarkStart w:id="45" w:name="nathan-machuki-onduma"/>
     <w:p>
       <w:pPr>
         <w:pStyle w:val="Heading1"/>
@@ -189,7 +189,7 @@
       </w:r>
     </w:p>
     <w:bookmarkEnd w:id="12"/>
-    <w:bookmarkStart w:id="31" w:name="professional-experience"/>
+    <w:bookmarkStart w:id="30" w:name="professional-experience"/>
     <w:p>
       <w:pPr>
         <w:pStyle w:val="Heading2"/>
@@ -243,7 +243,7 @@
         </w:numPr>
       </w:pPr>
       <w:r>
-        <w:t xml:space="preserve">Lead MEL strategy and implementation for visceral leishmaniasis and trachoma within multi‑country NTD programs spanning 30+ countries, supporting over $50M disbursed and 150M individuals reached annually</w:t>
+        <w:t xml:space="preserve">Lead MEL strategy and implementation for visceral leishmaniasis and trachoma within multi‑country NTD programs spanning 30+ countries, supporting over $50M disbursed and over 150M individuals reached annually</w:t>
       </w:r>
     </w:p>
     <w:p>
@@ -328,7 +328,7 @@
         </w:numPr>
       </w:pPr>
       <w:r>
-        <w:t xml:space="preserve">Designed and implemented MEL systems across 50+ low‑resource countries with limited M&amp;E capacity, strengthening data use for programmatic decision‑making.</w:t>
+        <w:t xml:space="preserve">Designed and implemented MEL systems across 30+ low‑resource countries with limited M&amp;E capacity, strengthening data use for programmatic decision‑making.</w:t>
       </w:r>
     </w:p>
     <w:p>
@@ -471,9 +471,14 @@
       <w:pPr>
         <w:pStyle w:val="Heading3"/>
       </w:pPr>
-      <w:r>
-        <w:t xml:space="preserve">Independent Consultant</w:t>
-      </w:r>
+      <w:hyperlink r:id="rId9">
+        <w:r>
+          <w:rPr>
+            <w:rStyle w:val="Hyperlink"/>
+          </w:rPr>
+          <w:t xml:space="preserve">Independent Consultant</w:t>
+        </w:r>
+      </w:hyperlink>
     </w:p>
     <w:p>
       <w:pPr>
@@ -506,7 +511,7 @@
         </w:numPr>
       </w:pPr>
       <w:r>
-        <w:t xml:space="preserve">Delivered statistical and MEL consulting services for global health and development programs funded by USAID, World Bank, and other partners.</w:t>
+        <w:t xml:space="preserve">Delivered statistical and MEL consulting services for global health and development programs funded by USAID, World Bank, and other donors and partners.</w:t>
       </w:r>
     </w:p>
     <w:p>
@@ -815,7 +820,7 @@
         </w:numPr>
       </w:pPr>
       <w:r>
-        <w:t xml:space="preserve">Managed M&amp;E systems for donor-funded health programs.</w:t>
+        <w:t xml:space="preserve">Developed and managed monitoring and evaluation systems for donor-funded RMNCAH (Reproductive, Maternal, Newborn, Child, and Adolescent Health) programs.</w:t>
       </w:r>
     </w:p>
     <w:p>
@@ -903,7 +908,7 @@
       </w:r>
     </w:p>
     <w:bookmarkEnd w:id="22"/>
-    <w:bookmarkStart w:id="30" w:name="X25c0948727970404fa58de2e57afb60c9f97fa7"/>
+    <w:bookmarkStart w:id="29" w:name="X25c0948727970404fa58de2e57afb60c9f97fa7"/>
     <w:p>
       <w:pPr>
         <w:pStyle w:val="Heading3"/>
@@ -1008,7 +1013,7 @@
         </w:numPr>
       </w:pPr>
       <w:r>
-        <w:t xml:space="preserve">Produced</w:t>
+        <w:t xml:space="preserve">Led the production of</w:t>
       </w:r>
       <w:r>
         <w:t xml:space="preserve"> </w:t>
@@ -1018,14 +1023,14 @@
           <w:rPr>
             <w:rStyle w:val="Hyperlink"/>
           </w:rPr>
-          <w:t xml:space="preserve">Nyamira County’s first Statistical Abstract</w:t>
+          <w:t xml:space="preserve">Nyamira County’s inaugural Statistical Abstract</w:t>
         </w:r>
       </w:hyperlink>
       <w:r>
         <w:t xml:space="preserve"> </w:t>
       </w:r>
       <w:r>
-        <w:t xml:space="preserve">in collaboration with the Kenya National Bureau of Statistics.</w:t>
+        <w:t xml:space="preserve">in collaboration with the Kenya National Bureau of Statistics providing a foundation for evidence-based economic planning.</w:t>
       </w:r>
     </w:p>
     <w:p>
@@ -1037,29 +1042,35 @@
         </w:numPr>
       </w:pPr>
       <w:r>
-        <w:t xml:space="preserve">Led development of County Integrated Development Plans [</w:t>
+        <w:t xml:space="preserve">Led the development of</w:t>
+      </w:r>
+      <w:r>
+        <w:t xml:space="preserve"> </w:t>
       </w:r>
       <w:hyperlink r:id="rId25">
         <w:r>
           <w:rPr>
             <w:rStyle w:val="Hyperlink"/>
           </w:rPr>
-          <w:t xml:space="preserve">first</w:t>
+          <w:t xml:space="preserve">the inaugural County Integrated Development Plan</w:t>
         </w:r>
       </w:hyperlink>
       <w:r>
-        <w:t xml:space="preserve">] and budget policy documents [</w:t>
+        <w:t xml:space="preserve">, multi-year (</w:t>
       </w:r>
       <w:hyperlink r:id="rId26">
         <w:r>
           <w:rPr>
             <w:rStyle w:val="Hyperlink"/>
           </w:rPr>
-          <w:t xml:space="preserve">this</w:t>
+          <w:t xml:space="preserve">2013/2014</w:t>
         </w:r>
       </w:hyperlink>
       <w:r>
-        <w:t xml:space="preserve">,</w:t>
+        <w:t xml:space="preserve"> </w:t>
+      </w:r>
+      <w:r>
+        <w:t xml:space="preserve">to</w:t>
       </w:r>
       <w:r>
         <w:t xml:space="preserve"> </w:t>
@@ -1069,11 +1080,11 @@
           <w:rPr>
             <w:rStyle w:val="Hyperlink"/>
           </w:rPr>
-          <w:t xml:space="preserve">this</w:t>
+          <w:t xml:space="preserve">2015/2016</w:t>
         </w:r>
       </w:hyperlink>
       <w:r>
-        <w:t xml:space="preserve">,</w:t>
+        <w:t xml:space="preserve">) budget policy documents, and strategic frameworks, plans and</w:t>
       </w:r>
       <w:r>
         <w:t xml:space="preserve"> </w:t>
@@ -1083,22 +1094,11 @@
           <w:rPr>
             <w:rStyle w:val="Hyperlink"/>
           </w:rPr>
-          <w:t xml:space="preserve">this</w:t>
+          <w:t xml:space="preserve">reports</w:t>
         </w:r>
       </w:hyperlink>
       <w:r>
-        <w:t xml:space="preserve">] and strategic frameworks and reports [</w:t>
-      </w:r>
-      <w:hyperlink r:id="rId29">
-        <w:r>
-          <w:rPr>
-            <w:rStyle w:val="Hyperlink"/>
-          </w:rPr>
-          <w:t xml:space="preserve">this</w:t>
-        </w:r>
-      </w:hyperlink>
-      <w:r>
-        <w:t xml:space="preserve">].</w:t>
+        <w:t xml:space="preserve">, ensuring alignment with county and national priorities.</w:t>
       </w:r>
     </w:p>
     <w:p>
@@ -1110,7 +1110,7 @@
         </w:numPr>
       </w:pPr>
       <w:r>
-        <w:t xml:space="preserve">Developed Nyamira County M&amp;E indicators in partnership with UNDP and UN-Women.</w:t>
+        <w:t xml:space="preserve">Developed Nyamira County M&amp;E indicators in partnership with UNDP and UN-Women to support tracking of the key performance indicators.</w:t>
       </w:r>
     </w:p>
     <w:p>
@@ -1122,12 +1122,12 @@
         </w:numPr>
       </w:pPr>
       <w:r>
-        <w:t xml:space="preserve">Established the Borabu District Information and Documentation Centre.</w:t>
-      </w:r>
-    </w:p>
+        <w:t xml:space="preserve">Founded the Borabu District Information and Documentation Centre, improving transparency and accessibility of government development plans and strategies for civil servants and citizens.</w:t>
+      </w:r>
+    </w:p>
+    <w:bookmarkEnd w:id="29"/>
     <w:bookmarkEnd w:id="30"/>
-    <w:bookmarkEnd w:id="31"/>
-    <w:bookmarkStart w:id="34" w:name="education"/>
+    <w:bookmarkStart w:id="33" w:name="education"/>
     <w:p>
       <w:pPr>
         <w:pStyle w:val="Heading2"/>
@@ -1144,7 +1144,7 @@
           <w:numId w:val="1012"/>
         </w:numPr>
       </w:pPr>
-      <w:hyperlink r:id="rId32">
+      <w:hyperlink r:id="rId31">
         <w:r>
           <w:rPr>
             <w:rStyle w:val="Hyperlink"/>
@@ -1175,7 +1175,7 @@
           <w:numId w:val="1012"/>
         </w:numPr>
       </w:pPr>
-      <w:hyperlink r:id="rId33">
+      <w:hyperlink r:id="rId32">
         <w:r>
           <w:rPr>
             <w:rStyle w:val="Hyperlink"/>
@@ -1228,8 +1228,8 @@
         <w:t xml:space="preserve">, Nyamagwa Boys’ High School, Kenya — 2003</w:t>
       </w:r>
     </w:p>
-    <w:bookmarkEnd w:id="34"/>
-    <w:bookmarkStart w:id="35" w:name="technical-skills"/>
+    <w:bookmarkEnd w:id="33"/>
+    <w:bookmarkStart w:id="34" w:name="technical-skills"/>
     <w:p>
       <w:pPr>
         <w:pStyle w:val="Heading2"/>
@@ -1326,8 +1326,8 @@
         <w:t xml:space="preserve">Survey design, statistical modelling, data visualization, LaTeX</w:t>
       </w:r>
     </w:p>
-    <w:bookmarkEnd w:id="35"/>
-    <w:bookmarkStart w:id="38" w:name="selected-professional-development"/>
+    <w:bookmarkEnd w:id="34"/>
+    <w:bookmarkStart w:id="37" w:name="selected-professional-development"/>
     <w:p>
       <w:pPr>
         <w:pStyle w:val="Heading2"/>
@@ -1360,7 +1360,7 @@
       <w:r>
         <w:t xml:space="preserve"> </w:t>
       </w:r>
-      <w:hyperlink r:id="rId36">
+      <w:hyperlink r:id="rId35">
         <w:r>
           <w:rPr>
             <w:rStyle w:val="Hyperlink"/>
@@ -1481,7 +1481,7 @@
       <w:r>
         <w:t xml:space="preserve"> </w:t>
       </w:r>
-      <w:hyperlink r:id="rId37">
+      <w:hyperlink r:id="rId36">
         <w:r>
           <w:rPr>
             <w:rStyle w:val="Hyperlink"/>
@@ -1493,8 +1493,8 @@
         <w:t xml:space="preserve">, CDC Kenya, 2017</w:t>
       </w:r>
     </w:p>
-    <w:bookmarkEnd w:id="38"/>
-    <w:bookmarkStart w:id="42" w:name="selected-publications"/>
+    <w:bookmarkEnd w:id="37"/>
+    <w:bookmarkStart w:id="41" w:name="selected-publications"/>
     <w:p>
       <w:pPr>
         <w:pStyle w:val="Heading2"/>
@@ -1540,7 +1540,7 @@
       <w:r>
         <w:t xml:space="preserve"> </w:t>
       </w:r>
-      <w:hyperlink r:id="rId39">
+      <w:hyperlink r:id="rId38">
         <w:r>
           <w:rPr>
             <w:rStyle w:val="Hyperlink"/>
@@ -1586,7 +1586,7 @@
       <w:r>
         <w:t xml:space="preserve"> </w:t>
       </w:r>
-      <w:hyperlink r:id="rId40">
+      <w:hyperlink r:id="rId39">
         <w:r>
           <w:rPr>
             <w:rStyle w:val="Hyperlink"/>
@@ -1629,7 +1629,7 @@
       <w:r>
         <w:t xml:space="preserve"> </w:t>
       </w:r>
-      <w:hyperlink r:id="rId41">
+      <w:hyperlink r:id="rId40">
         <w:r>
           <w:rPr>
             <w:rStyle w:val="Hyperlink"/>
@@ -1720,54 +1720,54 @@
         <w:t xml:space="preserve">Undergraduate project, University of Nairobi.</w:t>
       </w:r>
     </w:p>
+    <w:bookmarkEnd w:id="41"/>
+    <w:bookmarkStart w:id="42" w:name="languages"/>
+    <w:p>
+      <w:pPr>
+        <w:pStyle w:val="Heading2"/>
+      </w:pPr>
+      <w:r>
+        <w:t xml:space="preserve">Languages</w:t>
+      </w:r>
+    </w:p>
+    <w:p>
+      <w:pPr>
+        <w:pStyle w:val="Compact"/>
+        <w:numPr>
+          <w:ilvl w:val="0"/>
+          <w:numId w:val="1016"/>
+        </w:numPr>
+      </w:pPr>
+      <w:r>
+        <w:t xml:space="preserve">English — Full professional proficiency</w:t>
+      </w:r>
+    </w:p>
+    <w:p>
+      <w:pPr>
+        <w:pStyle w:val="Compact"/>
+        <w:numPr>
+          <w:ilvl w:val="0"/>
+          <w:numId w:val="1016"/>
+        </w:numPr>
+      </w:pPr>
+      <w:r>
+        <w:t xml:space="preserve">Kiswahili — Full professional proficiency</w:t>
+      </w:r>
+    </w:p>
+    <w:p>
+      <w:pPr>
+        <w:pStyle w:val="Compact"/>
+        <w:numPr>
+          <w:ilvl w:val="0"/>
+          <w:numId w:val="1016"/>
+        </w:numPr>
+      </w:pPr>
+      <w:r>
+        <w:t xml:space="preserve">French — Basic proficiency</w:t>
+      </w:r>
+    </w:p>
     <w:bookmarkEnd w:id="42"/>
-    <w:bookmarkStart w:id="43" w:name="languages"/>
-    <w:p>
-      <w:pPr>
-        <w:pStyle w:val="Heading2"/>
-      </w:pPr>
-      <w:r>
-        <w:t xml:space="preserve">Languages</w:t>
-      </w:r>
-    </w:p>
-    <w:p>
-      <w:pPr>
-        <w:pStyle w:val="Compact"/>
-        <w:numPr>
-          <w:ilvl w:val="0"/>
-          <w:numId w:val="1016"/>
-        </w:numPr>
-      </w:pPr>
-      <w:r>
-        <w:t xml:space="preserve">English — Full professional proficiency</w:t>
-      </w:r>
-    </w:p>
-    <w:p>
-      <w:pPr>
-        <w:pStyle w:val="Compact"/>
-        <w:numPr>
-          <w:ilvl w:val="0"/>
-          <w:numId w:val="1016"/>
-        </w:numPr>
-      </w:pPr>
-      <w:r>
-        <w:t xml:space="preserve">Kiswahili — Full professional proficiency</w:t>
-      </w:r>
-    </w:p>
-    <w:p>
-      <w:pPr>
-        <w:pStyle w:val="Compact"/>
-        <w:numPr>
-          <w:ilvl w:val="0"/>
-          <w:numId w:val="1016"/>
-        </w:numPr>
-      </w:pPr>
-      <w:r>
-        <w:t xml:space="preserve">French — Basic proficiency</w:t>
-      </w:r>
-    </w:p>
-    <w:bookmarkEnd w:id="43"/>
-    <w:bookmarkStart w:id="44" w:name="selected-awards"/>
+    <w:bookmarkStart w:id="43" w:name="selected-awards"/>
     <w:p>
       <w:pPr>
         <w:pStyle w:val="Heading2"/>
@@ -1795,7 +1795,7 @@
         <w:t xml:space="preserve"> </w:t>
       </w:r>
       <w:r>
-        <w:t xml:space="preserve">Recognized by University of Maryland Kenya Country Director as</w:t>
+        <w:t xml:space="preserve">Recognized by the University of Maryland Kenya Country Director as</w:t>
       </w:r>
       <w:r>
         <w:t xml:space="preserve"> </w:t>
@@ -1833,7 +1833,7 @@
         <w:t xml:space="preserve"> </w:t>
       </w:r>
       <w:r>
-        <w:t xml:space="preserve">Best 2nd Year Student, School of Mathematics, University of Nairobi.</w:t>
+        <w:t xml:space="preserve">Awarded university fees waiver after being recognized as the Best Second-Year Student, School of Mathematics, University of Nairobi.</w:t>
       </w:r>
     </w:p>
     <w:p>
@@ -1855,7 +1855,7 @@
         <w:t xml:space="preserve"> </w:t>
       </w:r>
       <w:r>
-        <w:t xml:space="preserve">Best 1st Year Student, Statistics Section, University of Nairobi.</w:t>
+        <w:t xml:space="preserve">Best First-Year Student, Statistics Section, University of Nairobi.</w:t>
       </w:r>
     </w:p>
     <w:p>
@@ -1877,29 +1877,29 @@
         <w:t xml:space="preserve"> </w:t>
       </w:r>
       <w:r>
-        <w:t xml:space="preserve">Second-best KCSE student in Gucha District, Kenya.</w:t>
+        <w:t xml:space="preserve">Ranked second-best KCSE student in Gucha District, Kenya.</w:t>
+      </w:r>
+    </w:p>
+    <w:bookmarkEnd w:id="43"/>
+    <w:bookmarkStart w:id="44" w:name="referees"/>
+    <w:p>
+      <w:pPr>
+        <w:pStyle w:val="Heading2"/>
+      </w:pPr>
+      <w:r>
+        <w:t xml:space="preserve">Referees</w:t>
+      </w:r>
+    </w:p>
+    <w:p>
+      <w:pPr>
+        <w:pStyle w:val="FirstParagraph"/>
+      </w:pPr>
+      <w:r>
+        <w:t xml:space="preserve">Available upon request.</w:t>
       </w:r>
     </w:p>
     <w:bookmarkEnd w:id="44"/>
-    <w:bookmarkStart w:id="45" w:name="referees"/>
-    <w:p>
-      <w:pPr>
-        <w:pStyle w:val="Heading2"/>
-      </w:pPr>
-      <w:r>
-        <w:t xml:space="preserve">Referees</w:t>
-      </w:r>
-    </w:p>
-    <w:p>
-      <w:pPr>
-        <w:pStyle w:val="FirstParagraph"/>
-      </w:pPr>
-      <w:r>
-        <w:t xml:space="preserve">Available upon request.</w:t>
-      </w:r>
-    </w:p>
     <w:bookmarkEnd w:id="45"/>
-    <w:bookmarkEnd w:id="46"/>
     <w:sectPr>
       <w:footnotePr>
         <w:numRestart w:val="eachSect"/>

</xml_diff>